<commit_message>
Publish site (data built 2026-10-31 02:20)
</commit_message>
<xml_diff>
--- a/docs/data/site/codebook.docx
+++ b/docs/data/site/codebook.docx
@@ -604,7 +604,7 @@
     <w:p/>
     <w:p>
       <w:r>
-        <w:t>See also: 2009 IRS administration.</w:t>
+        <w:t>See also: 2009 tax administration.</w:t>
       </w:r>
     </w:p>
     <w:p/>
@@ -1603,7 +1603,7 @@
     <w:p/>
     <w:p>
       <w:r>
-        <w:t>See also: 401 inspections of food imports; 321 FDA regulation of drugs and supplements.</w:t>
+        <w:t>See also: 401 inspections of food imports; 321 regulation of drugs and supplements.</w:t>
       </w:r>
     </w:p>
     <w:p/>
@@ -1868,7 +1868,7 @@
     <w:p/>
     <w:p>
       <w:r>
-        <w:t>Special Note: Industry-specific observations are coded according to substantive issue area when possible: 1003 FAA regulation of pilot rest periods; 602 teacher strikes.</w:t>
+        <w:t>Special Note: Industry-specific observations are coded according to substantive issue area when possible: 1003 regulation of pilot rest periods; 602 teacher strikes.</w:t>
       </w:r>
     </w:p>
     <w:p/>
@@ -2168,7 +2168,7 @@
     <w:p/>
     <w:p>
       <w:r>
-        <w:t>See also: 602 general reform efforts aimed at increasing the quality of education (e.g., NCLB), teacher certification standards for all teachers.</w:t>
+        <w:t>See also: 602 general reform efforts aimed at increasing the quality of education (e.g., school accountability standards), teacher certification standards for all teachers.</w:t>
       </w:r>
     </w:p>
     <w:p/>
@@ -2196,7 +2196,7 @@
     <w:p/>
     <w:p>
       <w:r>
-        <w:t>See also: 1707 public broadcasting; 1798 NSF funding; 200s civil rights issues related to the arts.</w:t>
+        <w:t>See also: 1707 public broadcasting; 1798 research funding; 200s civil rights issues related to the arts.</w:t>
       </w:r>
     </w:p>
     <w:p/>
@@ -2477,7 +2477,7 @@
       </w:r>
       <w:proofErr w:type="gramEnd"/>
       <w:r>
-        <w:t xml:space="preserve"> of domesticated animals or animals under human control; 408 fishery conservation and management; 1902 international agreements on resource/wildlife conservation; 2101 national parks; 2103 public lands management.</w:t>
+        <w:t xml:space="preserve"> of domesticated animals or animals under human control; 408 fishery conservation and management; 1902 international agreements on resource/wildlife conservation; 2101 state parks; 2103 public lands management.</w:t>
       </w:r>
     </w:p>
     <w:p/>
@@ -2561,7 +2561,7 @@
         <w:t xml:space="preserve">state </w:t>
       </w:r>
       <w:r>
-        <w:t>land regulation, including conservation at national parks; 2104 water development projects.</w:t>
+        <w:t>land regulation, including conservation at state parks; 2104 water development projects.</w:t>
       </w:r>
     </w:p>
     <w:p/>
@@ -2636,7 +2636,7 @@
     <w:p/>
     <w:p>
       <w:r>
-        <w:t>See also: 801 NRC-only appropriations requests; 2104 energy and water development projects.</w:t>
+        <w:t>See also: 801 nuclear energy and nuclear plant safety; 2104 energy and water development projects.</w:t>
       </w:r>
     </w:p>
     <w:p/>
@@ -2708,7 +2708,7 @@
       </w:r>
       <w:proofErr w:type="gramEnd"/>
       <w:r>
-        <w:t xml:space="preserve"> regulations; 801 nuclear energy generation; 803 natural gas and oil drilling; 805 coal mining and clean coal burning; 806 renewal energy requirements for utility companies.</w:t>
+        <w:t xml:space="preserve"> regulations; 801 nuclear energy generation; 803 natural gas and oil drilling; 805 coal mining and clean coal burning; 806 renewable energy requirements for utility companies.</w:t>
       </w:r>
     </w:p>
     <w:p/>
@@ -2892,7 +2892,7 @@
     <w:p/>
     <w:p>
       <w:r>
-        <w:t>See also: 529 migrant and seasonal workers; 1201 border patrol issues; 1524 tourism and tourism visas; 1929 passport issues, including visas for Americans traveling abroad.</w:t>
+        <w:t>See also: 529 migrant and seasonal workers; 1201 law enforcement cooperation on immigration; 1524 tourism and tourism visas; 1929 passport issues, including visas for Americans traveling abroad.</w:t>
       </w:r>
     </w:p>
     <w:p/>
@@ -2935,7 +2935,7 @@
     <w:p/>
     <w:p>
       <w:r>
-        <w:t>See also: 1003 budget requests and appropriations for FAA and CAB.</w:t>
+        <w:t>See also: 1003 appropriations for airports and aviation.</w:t>
       </w:r>
     </w:p>
     <w:p/>
@@ -3070,7 +3070,7 @@
     <w:p/>
     <w:p>
       <w:r>
-        <w:t>See also: 705 automobile emissions regulation, automobile Corporate Average Fuel Economy (CAFE) standards.</w:t>
+        <w:t>See also: 705 automobile emissions regulation, vehicle fuel economy standards.</w:t>
       </w:r>
     </w:p>
     <w:p/>
@@ -3229,13 +3229,13 @@
     <w:p/>
     <w:p>
       <w:r>
-        <w:t>See also: 2009 IRS administration.</w:t>
-      </w:r>
-    </w:p>
-    <w:p/>
-    <w:p>
-      <w:r>
-        <w:t>Special Note: For issues related to the Department of Homeland Security and domestic terrorism prevention efforts see the coding guidelines above.</w:t>
+        <w:t>See also: 2009 tax administration.</w:t>
+      </w:r>
+    </w:p>
+    <w:p/>
+    <w:p>
+      <w:r>
+        <w:t>Special Note: For issues related to homeland security and domestic terrorism prevention efforts see the coding guidelines above.</w:t>
       </w:r>
     </w:p>
     <w:p/>
@@ -3437,7 +3437,7 @@
     <w:p/>
     <w:p>
       <w:r>
-        <w:t>Special Note: Observations mentioning child tax credits were moved into 1302 in the 2019 update of the codebook. See the note on page 2.</w:t>
+        <w:t>Special Note: Observations mentioning child tax credits were moved into 1302 in the 2019 update of the codebook. See the note in About the codebook.</w:t>
       </w:r>
     </w:p>
     <w:p/>
@@ -3574,7 +3574,7 @@
     <w:p/>
     <w:p>
       <w:r>
-        <w:t>See also: 300 HHS appropriations specific to health; 300 HEW appropriations specific to health; 600 HEW appropriations specific to education.</w:t>
+        <w:t>See also: 300 appropriations specific to health agencies; 600 appropriations specific to education agencies.</w:t>
       </w:r>
     </w:p>
     <w:p/>
@@ -3630,7 +3630,7 @@
     <w:p/>
     <w:p>
       <w:r>
-        <w:t>Special Note: AFDC issues go in this category even if it also refers to Social Security Act or Administration (Title IV), child welfare issues associated with Social Security Act go in this category as well, Earned Income Tax Credit (EITC).</w:t>
+        <w:t>Special Note: TANF (formerly AFDC), including state programs under Title IV of the Social Security Act, and the Earned Income Tax Credit (EITC) go in this category.</w:t>
       </w:r>
     </w:p>
     <w:p/>
@@ -3664,7 +3664,7 @@
     <w:p/>
     <w:p>
       <w:r>
-        <w:t>Special Note: Omnibus legislation which includes multiple topics under Social Security goes in this category. In addition, specific topics such as changes to the SSA for the purpose of child welfare, housing, etc. should be coded in those more precise subtopics. Bills with no specific references to health care but are SS related, should be coded in this subtopic.</w:t>
+        <w:t>Special Note: Bills about retirement income and assistance for older residents go here; elderly housing, nutrition and health go in their own subtopics.</w:t>
       </w:r>
     </w:p>
     <w:p/>
@@ -3778,7 +3778,7 @@
     <w:p/>
     <w:p>
       <w:r>
-        <w:t>Special Note: This category was converted to from 508 to 1308 the align with the Comparative Agendas Project codebook.</w:t>
+        <w:t>Special Note: This category was converted from 508 to 1308 to align with the Comparative Agendas Project codebook.</w:t>
       </w:r>
     </w:p>
     <w:p/>
@@ -4142,10 +4142,10 @@
         <w:t xml:space="preserve">See also: </w:t>
       </w:r>
       <w:r>
-        <w:t>104 treasury agency</w:t>
-      </w:r>
-      <w:r>
-        <w:t xml:space="preserve"> appropriations.</w:t>
+        <w:t>104 State Treasurer appropriations</w:t>
+      </w:r>
+      <w:r>
+        <w:t>.</w:t>
       </w:r>
     </w:p>
     <w:p/>
@@ -4173,7 +4173,7 @@
     <w:p/>
     <w:p>
       <w:r>
-        <w:t>See also: 1504 consumer credit and oversight of credit rating agencies involvement in consumer credit; 1525 Truth-in-Lending Act; 1525 financial consumer protection; 1202 prosecution of financial crimes.</w:t>
+        <w:t>See also: 1504 consumer credit and oversight of credit rating agencies involvement in consumer credit; 1525 lending disclosure requirements; 1525 financial consumer protection; 1202 prosecution of financial crimes.</w:t>
       </w:r>
     </w:p>
     <w:p/>
@@ -4285,7 +4285,7 @@
     <w:p/>
     <w:p>
       <w:r>
-        <w:t>See also: 1204 bankruptcy courts; 530 employee benefits during bankruptcy; 1003 bankruptcies in airline industry.</w:t>
+        <w:t>See also: 1204 bankruptcy courts; 503 employee benefits during bankruptcy; 1003 bankruptcies in airline industry.</w:t>
       </w:r>
     </w:p>
     <w:p/>
@@ -4341,7 +4341,7 @@
     <w:p/>
     <w:p>
       <w:r>
-        <w:t>See also: 700s effect of environmental policy on small businesses; 500s effect of labor policy on small businesses; 300s effect of health care policy on small businesses; 1523 small business disaster loan programs; 201 SBA minority business programs; 1609 VA small business loans.</w:t>
+        <w:t>See also: 700s effect of environmental policy on small businesses; 500s effect of labor policy on small businesses; 300s effect of health care policy on small businesses; 1523 small business disaster loan programs; 201 minority business programs; 1609 small business loans for veterans.</w:t>
       </w:r>
     </w:p>
     <w:p/>
@@ -4543,7 +4543,7 @@
     <w:p/>
     <w:p>
       <w:r>
-        <w:t>See also: 1701 NASA\DOD issues; 1615 DHS appropriations.</w:t>
+        <w:t>See also: 1701 space exploration; 1615 homeland security appropriations.</w:t>
       </w:r>
     </w:p>
     <w:p/>
@@ -4607,15 +4607,13 @@
       </w:r>
       <w:proofErr w:type="gramEnd"/>
       <w:r>
-        <w:t xml:space="preserve"> of information; 1201 FBI </w:t>
+        <w:t xml:space="preserve"> of information; 1201 law enforcement counter-intelligence</w:t>
       </w:r>
       <w:proofErr w:type="gramStart"/>
-      <w:r>
-        <w:t>counter-intelligence</w:t>
-      </w:r>
+      <w:r/>
       <w:proofErr w:type="gramEnd"/>
       <w:r>
-        <w:t>; 1929 intelligence collection by the Department of State.</w:t>
+        <w:t>.</w:t>
       </w:r>
     </w:p>
     <w:p/>
@@ -4736,7 +4734,7 @@
     <w:p/>
     <w:p>
       <w:r>
-        <w:t>See also: 601 GI Bill and military academies; 1609 veterans; 1612 reserves.</w:t>
+        <w:t>See also: 601 veterans’ education benefits and military academies; 1609 veterans; 1612 reserves.</w:t>
       </w:r>
     </w:p>
     <w:p/>
@@ -4764,7 +4762,7 @@
     <w:p/>
     <w:p>
       <w:r>
-        <w:t>See also: 300 series for veteran health care; 601 veteran education benefits; 1407 veteran housing; 1409 homeless veterans; 2008 designating/naming Veterans Administration hospitals and medical centers; 1608 on-base military housing and retired military personnel; 502 for job training.</w:t>
+        <w:t>See also: 300 series for veteran health care; 601 veteran education benefits; 1407 veteran housing; 1409 homeless veterans; 2008 naming veterans’ homes and medical facilities; 1608 on-base military housing and retired military personnel; 502 for job training.</w:t>
       </w:r>
     </w:p>
     <w:p/>
@@ -4898,13 +4896,13 @@
     <w:p/>
     <w:p>
       <w:r>
-        <w:t>Special Note: For issues related to the Department of Homeland Security and domestic terrorism prevention efforts, see the general coding guidelines above.</w:t>
-      </w:r>
-    </w:p>
-    <w:p/>
-    <w:p>
-      <w:r>
-        <w:t>See also: 200s hate crimes; 1201 border patrol; 1523 FEMA domestic (weather related) disaster relief; 1927 efforts to counter international terrorism not targeted at the United States; 1619 military operations against terrorism.</w:t>
+        <w:t>Special Note: For issues related to homeland security and domestic terrorism prevention efforts, see the general coding guidelines above.</w:t>
+      </w:r>
+    </w:p>
+    <w:p/>
+    <w:p>
+      <w:r>
+        <w:t>See also: 200s hate crimes; 1201 law enforcement; 1523 domestic (weather-related) disaster relief; 1927 efforts to counter international terrorism not targeted at the United States; 1619 military operations against terrorism.</w:t>
       </w:r>
     </w:p>
     <w:p/>
@@ -4976,7 +4974,7 @@
     <w:p/>
     <w:p>
       <w:r>
-        <w:t>See also: 1620 settlement of war-related claims against the U.S. Government; 200s civil rights-related policy related to war or prisoners of war.</w:t>
+        <w:t>See also: 1620 settlement of war-related claims against the military; 200s civil rights-related policy related to war or prisoners of war.</w:t>
       </w:r>
     </w:p>
     <w:p/>
@@ -4998,13 +4996,13 @@
     <w:p/>
     <w:p>
       <w:r>
-        <w:t>Rule: Observations related to the relief of claims against the U.S. military.</w:t>
-      </w:r>
-    </w:p>
-    <w:p/>
-    <w:p>
-      <w:r>
-        <w:t>See also: 1929 International or Foreign Claims Act; Foreign Claims Settlement Commission; 2015 claims against the U.S. Government.</w:t>
+        <w:t>Rule: Observations related to the relief of claims against the military.</w:t>
+      </w:r>
+    </w:p>
+    <w:p/>
+    <w:p>
+      <w:r>
+        <w:t>See also: 1929 International or Foreign Claims Act; Foreign Claims Settlement Commission; 2015 claims against the state.</w:t>
       </w:r>
     </w:p>
     <w:p/>
@@ -5054,7 +5052,7 @@
     <w:p/>
     <w:p>
       <w:r>
-        <w:t>See also: 2101 military parks and memorials. 17. Space, Science and Communications</w:t>
+        <w:t>See also: 2101 military parks and memorials.</w:t>
       </w:r>
     </w:p>
     <w:p/>
@@ -5091,7 +5089,7 @@
     <w:p/>
     <w:p>
       <w:r>
-        <w:t>See also: 1798 NSF research funding.</w:t>
+        <w:t>See also: 1798 science research funding.</w:t>
       </w:r>
     </w:p>
     <w:p/>
@@ -5225,12 +5223,6 @@
     </w:p>
     <w:p/>
     <w:p>
-      <w:r>
-        <w:t>See also: 1929 Radio Free Europe program.</w:t>
-      </w:r>
-    </w:p>
-    <w:p/>
-    <w:p>
       <w:pPr>
         <w:rPr>
           <w:b/>
@@ -5290,7 +5282,7 @@
     <w:p/>
     <w:p>
       <w:r>
-        <w:t>See also: 1615 cyberterrorism against the United States; 1600s defense-related cybersecurity; 1202 individual prosecutions against cybercriminals.</w:t>
+        <w:t>See also: 1615 cyberterrorism; 1600s defense-related cybersecurity; 1202 individual prosecutions against cybercriminals.</w:t>
       </w:r>
     </w:p>
     <w:p/>
@@ -5859,7 +5851,7 @@
     <w:p/>
     <w:p>
       <w:r>
-        <w:t>See also: 1003 efforts to prevent hijacking in the U.S.; 1615 Department of Homeland Security-related functions and domestic terrorism prevention efforts within borders; 1619 military actions against terrorism.</w:t>
+        <w:t>See also: 1003 efforts to prevent hijacking in the U.S.; 1615 homeland security functions and domestic terrorism prevention efforts within borders; 1619 military actions against terrorism.</w:t>
       </w:r>
     </w:p>
     <w:p/>
@@ -5919,7 +5911,7 @@
     <w:p/>
     <w:p>
       <w:r>
-        <w:t>See also: 1603 espionage; 208 display of USIA programs in US.</w:t>
+        <w:t>See also: 1603 espionage.</w:t>
       </w:r>
     </w:p>
     <w:p/>
@@ -6415,7 +6407,7 @@
           <w:b/>
           <w:bCs/>
         </w:rPr>
-        <w:t>2015: Claims Against U.S. Government</w:t>
+        <w:t>2015: Claims Against the State</w:t>
       </w:r>
     </w:p>
     <w:p/>
@@ -6611,7 +6603,7 @@
     <w:p/>
     <w:p>
       <w:r>
-        <w:t>See also: 709 animal and forest protection; 803 oil and gas leasing; 805 coal leasing; 1611 military land conveyances; 2101 land conveyance for national parks/monuments.</w:t>
+        <w:t>See also: 709 animal and forest protection; 803 oil and gas leasing; 805 coal leasing; 1611 military land conveyances; 2101 land conveyance for state parks and historic sites.</w:t>
       </w:r>
     </w:p>
     <w:p/>

</xml_diff>